<commit_message>
refactor: saudação como placeholder {saudacao} no template DOCX
Antes, o backend substituía em tempo de execução uma sequência exata de
runs hardcoded ("Prezada</w:t></w:r>...Senhor</w:t>...a...,") no XML do
template para injetar a saudação. Se o template fosse reaberto/salvo no
Word (que reparte os runs), a substituição falharia silenciosamente e a
saudação ficaria fixa em "Prezada Senhora,".

Agora o placeholder {saudacao} está embutido no próprio
3-modelo-anexos.docx e o docxtemplater o preenche nativamente no
render(). Removida a cirurgia frágil de runs do exportController.

Testado ponta a ponta: geração produz "Prezada Senhora" para signatário
"Sra.", corpo e demais campos preenchidos, sem placeholders órfãos,
docx válido.

https://claude.ai/code/session_019xyjke4qrSb2nWYRPS1bYF
</commit_message>
<xml_diff>
--- a/backend/templates/3-modelo-anexos.docx
+++ b/backend/templates/3-modelo-anexos.docx
@@ -399,19 +399,7 @@
         <w:pStyle w:val="Corpodetexto"/>
       </w:pPr>
       <w:r>
-        <w:t>Prezada</w:t>
-      </w:r>
-      <w:r>
-        <w:t xml:space="preserve"> </w:t>
-      </w:r>
-      <w:r>
-        <w:t>Senhor</w:t>
-      </w:r>
-      <w:r>
-        <w:t>a</w:t>
-      </w:r>
-      <w:r>
-        <w:t>,</w:t>
+        <w:t>{saudacao}</w:t>
       </w:r>
     </w:p>
     <w:p>

</xml_diff>

<commit_message>
feat: melhorias de formatação do .docx (saudação, títulos, negrito, assinatura, endereço)
- #1 Vírgula na saudação ("Prezado Senhor," / "Prezada Senhora,").
- #2 Assinatura: uma malha por linha (loop {#reguladas} sobre {regulada}).
- #3 Títulos/subtítulos (ex.: "1. ", "I. ") sem recuo de 1ª linha e em negrito;
  demais parágrafos mantêm recuo e justificado. Corpo passa a ser montado como
  XML bruto ({@corpoXml}) para permitir formatação por parágrafo.
- #4 Nome da concessionária em negrito (parcial) na 1ª menção no corpo.
- #5 Endereço da ANTT: CEP e cidade na mesma linha ("CEP 70200-003 – Brasília/DF")
  — editado no template 3-modelo-anexos.docx.

Validado gerando um .docx de teste (várias malhas + títulos + nome de empresa):
sem placeholders remanescentes, negrito parcial correto, malhas uma por linha.

https://claude.ai/code/session_019xyjke4qrSb2nWYRPS1bYF
</commit_message>
<xml_diff>
--- a/backend/templates/3-modelo-anexos.docx
+++ b/backend/templates/3-modelo-anexos.docx
@@ -278,7 +278,7 @@
         <w:t xml:space="preserve"> </w:t>
       </w:r>
       <w:r>
-        <w:t>8 CEP 70200-003</w:t>
+        <w:t>8</w:t>
       </w:r>
     </w:p>
     <w:p>
@@ -291,28 +291,7 @@
         </w:rPr>
       </w:pPr>
       <w:r>
-        <w:t>Brasília</w:t>
-      </w:r>
-      <w:r>
-        <w:rPr>
-          <w:spacing w:val="-3"/>
-        </w:rPr>
-        <w:t xml:space="preserve"> </w:t>
-      </w:r>
-      <w:r>
-        <w:t>–</w:t>
-      </w:r>
-      <w:r>
-        <w:rPr>
-          <w:spacing w:val="-2"/>
-        </w:rPr>
-        <w:t xml:space="preserve"> </w:t>
-      </w:r>
-      <w:r>
-        <w:rPr>
-          <w:spacing w:val="-5"/>
-        </w:rPr>
-        <w:t>DF</w:t>
+        <w:t xml:space="preserve">CEP 70200-003 – Brasília/DF</w:t>
       </w:r>
     </w:p>
     <w:p>

</xml_diff>